<commit_message>
Add Workforce Security & Sanction Policy (TM-SEC-POL-003) + docx renderings
- workforce-security-sanction-policy.md: drafted from the template — authorization,
  clearance/screening, supervision, immediate termination/role-change revocation,
  and a 4-tier sanctions table; maps to §164.308(a)(3) and the (a)(1)(ii)(C)
  Sanction Policy. REGISTER row updated Not started -> Draft.
- docx renderings of workforce-roles-ephi-access and the new policy (and refreshed
  REGISTER.docx).
</commit_message>
<xml_diff>
--- a/Compliance/REGISTER.docx
+++ b/Compliance/REGISTER.docx
@@ -516,7 +516,7 @@
               <w:rPr>
                 <w:i/>
               </w:rPr>
-              <w:t>[ ]</w:t>
+              <w:t>[Security Officer]</w:t>
             </w:r>
           </w:p>
         </w:tc>
@@ -527,7 +527,7 @@
           <w:p>
             <w:r/>
             <w:r>
-              <w:t>—</w:t>
+              <w:t>0.1</w:t>
             </w:r>
           </w:p>
         </w:tc>
@@ -538,7 +538,10 @@
           <w:p>
             <w:r/>
             <w:r>
-              <w:t>—</w:t>
+              <w:rPr>
+                <w:i/>
+              </w:rPr>
+              <w:t>[date]</w:t>
             </w:r>
           </w:p>
         </w:tc>
@@ -549,7 +552,10 @@
           <w:p>
             <w:r/>
             <w:r>
-              <w:t>—</w:t>
+              <w:rPr>
+                <w:i/>
+              </w:rPr>
+              <w:t>[date]</w:t>
             </w:r>
           </w:p>
         </w:tc>
@@ -560,7 +566,7 @@
           <w:p>
             <w:r/>
             <w:r>
-              <w:t>Not started</w:t>
+              <w:t>Draft</w:t>
             </w:r>
           </w:p>
         </w:tc>
@@ -1470,9 +1476,6 @@
     </w:tbl>
     <w:p/>
     <w:p>
-      <w:pPr>
-        <w:pStyle w:val="IntenseQuote"/>
-      </w:pPr>
       <w:r>
         <w:t xml:space="preserve">This list seeds the </w:t>
       </w:r>
@@ -1538,6 +1541,20 @@
       </w:r>
       <w:r>
         <w:t xml:space="preserve"> — standard template for each new policy</w:t>
+      </w:r>
+    </w:p>
+    <w:p>
+      <w:pPr>
+        <w:pStyle w:val="ListBullet"/>
+      </w:pPr>
+      <w:r>
+        <w:rPr>
+          <w:rFonts w:ascii="Consolas" w:hAnsi="Consolas"/>
+        </w:rPr>
+        <w:t>workforce-roles-ephi-access.md</w:t>
+      </w:r>
+      <w:r>
+        <w:t xml:space="preserve"> (TM‑SEC‑JD‑001) — workforce job descriptions, ePHI access scope &amp; required qualifications</w:t>
       </w:r>
     </w:p>
     <w:p>

</xml_diff>

<commit_message>
Update internal doc references from Markdown/.md to Word/.docx
Now that .docx is the source of truth, fix the stale self-references inside the
documents: "version-controlled Markdown" -> "Word documents", and the .md
filenames in the management process, REGISTER, and the workforce policy ->
.docx. Edited in place (python-docx), preserving all other content/formatting.
</commit_message>
<xml_diff>
--- a/Compliance/REGISTER.docx
+++ b/Compliance/REGISTER.docx
@@ -27,7 +27,7 @@
         <w:rPr>
           <w:rFonts w:ascii="Consolas" w:hAnsi="Consolas"/>
         </w:rPr>
-        <w:t>security-policy-management-process.md</w:t>
+        <w:t>security-policy-management-process.docx</w:t>
       </w:r>
       <w:r>
         <w:t xml:space="preserve"> (TM‑SEC‑PROC‑001).</w:t>
@@ -1486,7 +1486,7 @@
         <w:t>core HIPAA Security/Privacy Rule policies</w:t>
       </w:r>
       <w:r>
-        <w:t xml:space="preserve"> a Business Associate is expected to maintain — so the register doubles as a gap/roadmap. Add, merge, or remove rows to fit. Each row should point to a Markdown policy file in </w:t>
+        <w:t xml:space="preserve"> a Business Associate is expected to maintain — so the register doubles as a gap/roadmap. Add, merge, or remove rows to fit. Each row should point to a Word policy file in </w:t>
       </w:r>
       <w:r>
         <w:rPr>
@@ -1501,7 +1501,7 @@
         <w:rPr>
           <w:rFonts w:ascii="Consolas" w:hAnsi="Consolas"/>
         </w:rPr>
-        <w:t>policy-template.md</w:t>
+        <w:t>policy-template.docx</w:t>
       </w:r>
       <w:r>
         <w:t>) once started.</w:t>
@@ -1523,7 +1523,7 @@
         <w:rPr>
           <w:rFonts w:ascii="Consolas" w:hAnsi="Consolas"/>
         </w:rPr>
-        <w:t>security-policy-management-process.md</w:t>
+        <w:t>security-policy-management-process.docx</w:t>
       </w:r>
       <w:r>
         <w:t xml:space="preserve"> — how these policies are developed, approved, reviewed, updated</w:t>
@@ -1537,7 +1537,7 @@
         <w:rPr>
           <w:rFonts w:ascii="Consolas" w:hAnsi="Consolas"/>
         </w:rPr>
-        <w:t>policy-template.md</w:t>
+        <w:t>policy-template.docx</w:t>
       </w:r>
       <w:r>
         <w:t xml:space="preserve"> — standard template for each new policy</w:t>
@@ -1551,7 +1551,7 @@
         <w:rPr>
           <w:rFonts w:ascii="Consolas" w:hAnsi="Consolas"/>
         </w:rPr>
-        <w:t>workforce-roles-ephi-access.md</w:t>
+        <w:t>workforce-roles-ephi-access.docx</w:t>
       </w:r>
       <w:r>
         <w:t xml:space="preserve"> (TM‑SEC‑JD‑001) — workforce job descriptions, ePHI access scope &amp; required qualifications</w:t>

</xml_diff>

<commit_message>
Add Security Awareness & Training Policy (TM-SEC-POL-005)
Covers all four addressable specs of §164.308(a)(5)(ii): security reminders (A),
malicious-software protection (B), log-in monitoring (C), and password
management (D). The password section explicitly addresses the SRA Q15 elements —
roles/responsibilities, safeguarding passwords, responding to a compromised
password, and proper composition/change (aligned with NIST SP 800-63B), with
MFA required. REGISTER row updated Not started -> Draft. Delivered as .docx only.
</commit_message>
<xml_diff>
--- a/Compliance/REGISTER.docx
+++ b/Compliance/REGISTER.docx
@@ -681,12 +681,8 @@
             <w:tcW w:type="dxa" w:w="1234"/>
           </w:tcPr>
           <w:p>
-            <w:r/>
             <w:r>
-              <w:rPr>
-                <w:i/>
-              </w:rPr>
-              <w:t>[ ]</w:t>
+              <w:t>[Security Officer]</w:t>
             </w:r>
           </w:p>
         </w:tc>
@@ -695,9 +691,8 @@
             <w:tcW w:type="dxa" w:w="1234"/>
           </w:tcPr>
           <w:p>
-            <w:r/>
             <w:r>
-              <w:t>—</w:t>
+              <w:t>0.1</w:t>
             </w:r>
           </w:p>
         </w:tc>
@@ -706,9 +701,8 @@
             <w:tcW w:type="dxa" w:w="1234"/>
           </w:tcPr>
           <w:p>
-            <w:r/>
             <w:r>
-              <w:t>—</w:t>
+              <w:t>[date]</w:t>
             </w:r>
           </w:p>
         </w:tc>
@@ -717,9 +711,8 @@
             <w:tcW w:type="dxa" w:w="1234"/>
           </w:tcPr>
           <w:p>
-            <w:r/>
             <w:r>
-              <w:t>—</w:t>
+              <w:t>[date]</w:t>
             </w:r>
           </w:p>
         </w:tc>
@@ -728,9 +721,8 @@
             <w:tcW w:type="dxa" w:w="1234"/>
           </w:tcPr>
           <w:p>
-            <w:r/>
             <w:r>
-              <w:t>Not started</w:t>
+              <w:t>Draft</w:t>
             </w:r>
           </w:p>
         </w:tc>

</xml_diff>

<commit_message>
Fill owner/reviewer and review dates: Raja Gopalan, reviewed 2026-06-16
Set Owner = Security Officer (Raja Gopalan), Last reviewed = 2026-06-16, and
Next review due = 2027-06-16 across the process, JD, sanction, and awareness-
training documents (and the matching REGISTER rows + review-history reviewer).
Approval sign-off and other role incumbents intentionally left pending.
</commit_message>
<xml_diff>
--- a/Compliance/REGISTER.docx
+++ b/Compliance/REGISTER.docx
@@ -259,12 +259,8 @@
             <w:tcW w:type="dxa" w:w="1234"/>
           </w:tcPr>
           <w:p>
-            <w:r/>
             <w:r>
-              <w:rPr>
-                <w:i/>
-              </w:rPr>
-              <w:t>[Security Officer]</w:t>
+              <w:t>Security Officer (Raja Gopalan)</w:t>
             </w:r>
           </w:p>
         </w:tc>
@@ -284,12 +280,8 @@
             <w:tcW w:type="dxa" w:w="1234"/>
           </w:tcPr>
           <w:p>
-            <w:r/>
             <w:r>
-              <w:rPr>
-                <w:i/>
-              </w:rPr>
-              <w:t>[date]</w:t>
+              <w:t>2026-06-16</w:t>
             </w:r>
           </w:p>
         </w:tc>
@@ -298,12 +290,8 @@
             <w:tcW w:type="dxa" w:w="1234"/>
           </w:tcPr>
           <w:p>
-            <w:r/>
             <w:r>
-              <w:rPr>
-                <w:i/>
-              </w:rPr>
-              <w:t>[date]</w:t>
+              <w:t>2027-06-16</w:t>
             </w:r>
           </w:p>
         </w:tc>
@@ -511,12 +499,8 @@
             <w:tcW w:type="dxa" w:w="1234"/>
           </w:tcPr>
           <w:p>
-            <w:r/>
             <w:r>
-              <w:rPr>
-                <w:i/>
-              </w:rPr>
-              <w:t>[Security Officer]</w:t>
+              <w:t>Security Officer (Raja Gopalan)</w:t>
             </w:r>
           </w:p>
         </w:tc>
@@ -536,12 +520,8 @@
             <w:tcW w:type="dxa" w:w="1234"/>
           </w:tcPr>
           <w:p>
-            <w:r/>
             <w:r>
-              <w:rPr>
-                <w:i/>
-              </w:rPr>
-              <w:t>[date]</w:t>
+              <w:t>2026-06-16</w:t>
             </w:r>
           </w:p>
         </w:tc>
@@ -550,12 +530,8 @@
             <w:tcW w:type="dxa" w:w="1234"/>
           </w:tcPr>
           <w:p>
-            <w:r/>
             <w:r>
-              <w:rPr>
-                <w:i/>
-              </w:rPr>
-              <w:t>[date]</w:t>
+              <w:t>2027-06-16</w:t>
             </w:r>
           </w:p>
         </w:tc>
@@ -682,7 +658,7 @@
           </w:tcPr>
           <w:p>
             <w:r>
-              <w:t>[Security Officer]</w:t>
+              <w:t>Security Officer (Raja Gopalan)</w:t>
             </w:r>
           </w:p>
         </w:tc>
@@ -702,7 +678,7 @@
           </w:tcPr>
           <w:p>
             <w:r>
-              <w:t>[date]</w:t>
+              <w:t>2026-06-16</w:t>
             </w:r>
           </w:p>
         </w:tc>
@@ -712,7 +688,7 @@
           </w:tcPr>
           <w:p>
             <w:r>
-              <w:t>[date]</w:t>
+              <w:t>2027-06-16</w:t>
             </w:r>
           </w:p>
         </w:tc>

</xml_diff>

<commit_message>
Approve compliance documents v1.0 (Raja Gopalan, Security Officer, 2026-06-16)
- Status Draft -> Approved and Version -> 1.0 on the management process, workforce
  job descriptions, workforce security & sanction policy, and security awareness &
  training policy; approval blocks signed (Raja Gopalan / Security Officer /
  2026-06-16). This commit is the approval evidence per TM-SEC-PROC-001.
- workforce-roles-ephi-access: all four roles (Security Officer, Privacy Officer,
  Software Engineer/Developer, Cloud/Infra Admin) assigned to Raja Gopalan;
  acknowledgment signed.
- REGISTER: PROC-001, POL-003, POL-005 -> Approved, v1.0.
</commit_message>
<xml_diff>
--- a/Compliance/REGISTER.docx
+++ b/Compliance/REGISTER.docx
@@ -269,7 +269,6 @@
             <w:tcW w:type="dxa" w:w="1234"/>
           </w:tcPr>
           <w:p>
-            <w:r/>
             <w:r>
               <w:t>1.0</w:t>
             </w:r>
@@ -300,9 +299,8 @@
             <w:tcW w:type="dxa" w:w="1234"/>
           </w:tcPr>
           <w:p>
-            <w:r/>
             <w:r>
-              <w:t>Draft</w:t>
+              <w:t>Approved</w:t>
             </w:r>
           </w:p>
         </w:tc>
@@ -509,9 +507,8 @@
             <w:tcW w:type="dxa" w:w="1234"/>
           </w:tcPr>
           <w:p>
-            <w:r/>
             <w:r>
-              <w:t>0.1</w:t>
+              <w:t>1.0</w:t>
             </w:r>
           </w:p>
         </w:tc>
@@ -540,9 +537,8 @@
             <w:tcW w:type="dxa" w:w="1234"/>
           </w:tcPr>
           <w:p>
-            <w:r/>
             <w:r>
-              <w:t>Draft</w:t>
+              <w:t>Approved</w:t>
             </w:r>
           </w:p>
         </w:tc>
@@ -668,7 +664,7 @@
           </w:tcPr>
           <w:p>
             <w:r>
-              <w:t>0.1</w:t>
+              <w:t>1.0</w:t>
             </w:r>
           </w:p>
         </w:tc>
@@ -698,7 +694,7 @@
           </w:tcPr>
           <w:p>
             <w:r>
-              <w:t>Draft</w:t>
+              <w:t>Approved</w:t>
             </w:r>
           </w:p>
         </w:tc>

</xml_diff>

<commit_message>
Add Information Access Management & Access Control Policy (TM-SEC-POL-004) v1.0
Dedicated access-management policy covering §164.308(a)(4)(ii)(B) Access
Authorization, (C) Access Establishment & Modification, and the §164.312(a)(1)
technical controls (unique IDs, MFA, emergency access, automatic logoff, audit).
Consolidates the grant/review/modify/terminate process previously scattered
across POL-003 and JD-001, and resolves their dangling references to POL-004.
Approved v1.0 (Raja Gopalan / Security Officer / 2026-06-16); REGISTER updated
Not started -> Approved v1.0. Supports SRA Q3.
</commit_message>
<xml_diff>
--- a/Compliance/REGISTER.docx
+++ b/Compliance/REGISTER.docx
@@ -571,12 +571,8 @@
             <w:tcW w:type="dxa" w:w="1234"/>
           </w:tcPr>
           <w:p>
-            <w:r/>
             <w:r>
-              <w:rPr>
-                <w:i/>
-              </w:rPr>
-              <w:t>[ ]</w:t>
+              <w:t>Security Officer (Raja Gopalan)</w:t>
             </w:r>
           </w:p>
         </w:tc>
@@ -585,9 +581,8 @@
             <w:tcW w:type="dxa" w:w="1234"/>
           </w:tcPr>
           <w:p>
-            <w:r/>
             <w:r>
-              <w:t>—</w:t>
+              <w:t>1.0</w:t>
             </w:r>
           </w:p>
         </w:tc>
@@ -596,9 +591,8 @@
             <w:tcW w:type="dxa" w:w="1234"/>
           </w:tcPr>
           <w:p>
-            <w:r/>
             <w:r>
-              <w:t>—</w:t>
+              <w:t>2026-06-16</w:t>
             </w:r>
           </w:p>
         </w:tc>
@@ -607,9 +601,8 @@
             <w:tcW w:type="dxa" w:w="1234"/>
           </w:tcPr>
           <w:p>
-            <w:r/>
             <w:r>
-              <w:t>—</w:t>
+              <w:t>2027-06-16</w:t>
             </w:r>
           </w:p>
         </w:tc>
@@ -618,9 +611,8 @@
             <w:tcW w:type="dxa" w:w="1234"/>
           </w:tcPr>
           <w:p>
-            <w:r/>
             <w:r>
-              <w:t>Not started</w:t>
+              <w:t>Approved</w:t>
             </w:r>
           </w:p>
         </w:tc>

</xml_diff>

<commit_message>
Add Authentication & Transmission Security (Encryption) Policy (TM-SEC-POL-010) v1.0
Documents encryption at rest (Fernet field-encryption + GCP at-rest), in transit
(TLS 1.2+, future DTLS-SRTP), the addressable-spec evaluation (encryption assessed
via risk management; equivalent alternative safeguard when not reasonable and
appropriate), authentication (OAuth + MFA, §164.312(d)), and key management.
Covers §164.312(a)(2)(iv), (d), (e)(1), (e)(2)(ii) -- supports SRA Q9. Approved
v1.0 (Raja Gopalan / Security Officer / 2026-06-16); REGISTER updated Not started
-> Approved v1.0; resolves the POL-010 dangling references in POL-004/POL-005.
</commit_message>
<xml_diff>
--- a/Compliance/REGISTER.docx
+++ b/Compliance/REGISTER.docx
@@ -1047,12 +1047,8 @@
             <w:tcW w:type="dxa" w:w="1234"/>
           </w:tcPr>
           <w:p>
-            <w:r/>
             <w:r>
-              <w:rPr>
-                <w:i/>
-              </w:rPr>
-              <w:t>[ ]</w:t>
+              <w:t>Security Officer (Raja Gopalan)</w:t>
             </w:r>
           </w:p>
         </w:tc>
@@ -1061,9 +1057,8 @@
             <w:tcW w:type="dxa" w:w="1234"/>
           </w:tcPr>
           <w:p>
-            <w:r/>
             <w:r>
-              <w:t>—</w:t>
+              <w:t>1.0</w:t>
             </w:r>
           </w:p>
         </w:tc>
@@ -1072,9 +1067,8 @@
             <w:tcW w:type="dxa" w:w="1234"/>
           </w:tcPr>
           <w:p>
-            <w:r/>
             <w:r>
-              <w:t>—</w:t>
+              <w:t>2026-06-16</w:t>
             </w:r>
           </w:p>
         </w:tc>
@@ -1083,9 +1077,8 @@
             <w:tcW w:type="dxa" w:w="1234"/>
           </w:tcPr>
           <w:p>
-            <w:r/>
             <w:r>
-              <w:t>—</w:t>
+              <w:t>2027-06-16</w:t>
             </w:r>
           </w:p>
         </w:tc>
@@ -1094,9 +1087,8 @@
             <w:tcW w:type="dxa" w:w="1234"/>
           </w:tcPr>
           <w:p>
-            <w:r/>
             <w:r>
-              <w:t>Not started</w:t>
+              <w:t>Approved</w:t>
             </w:r>
           </w:p>
         </w:tc>

</xml_diff>

<commit_message>
Add remaining 10 HIPAA policies, Approved v1.0 — completes the policy set
POL-001 Security Management & Risk Management; POL-002 Assigned Security
Responsibility; POL-006 Incident Response; POL-007 Contingency Plan (GCP
backups/DR); POL-008 Device & Media Controls (cloud + GCP facility); POL-009
Audit Controls (append-only SHA-256 log); POL-011 Business Associate & Vendor
Management; POL-012 Breach Notification; POL-013 Privacy & Minimum Necessary;
POL-014 Data Retention & Disposal. All Approved v1.0 (Raja Gopalan / Security
Officer / 2026-06-16); REGISTER updated -> all 15 policies Approved. Backs the
remaining SRA questions across the Administrative/Physical/Technical safeguards.
</commit_message>
<xml_diff>
--- a/Compliance/REGISTER.docx
+++ b/Compliance/REGISTER.docx
@@ -333,12 +333,8 @@
             <w:tcW w:type="dxa" w:w="1234"/>
           </w:tcPr>
           <w:p>
-            <w:r/>
             <w:r>
-              <w:rPr>
-                <w:i/>
-              </w:rPr>
-              <w:t>[ ]</w:t>
+              <w:t>Security Officer (Raja Gopalan)</w:t>
             </w:r>
           </w:p>
         </w:tc>
@@ -347,9 +343,8 @@
             <w:tcW w:type="dxa" w:w="1234"/>
           </w:tcPr>
           <w:p>
-            <w:r/>
             <w:r>
-              <w:t>—</w:t>
+              <w:t>1.0</w:t>
             </w:r>
           </w:p>
         </w:tc>
@@ -358,9 +353,8 @@
             <w:tcW w:type="dxa" w:w="1234"/>
           </w:tcPr>
           <w:p>
-            <w:r/>
             <w:r>
-              <w:t>—</w:t>
+              <w:t>2026-06-16</w:t>
             </w:r>
           </w:p>
         </w:tc>
@@ -369,9 +363,8 @@
             <w:tcW w:type="dxa" w:w="1234"/>
           </w:tcPr>
           <w:p>
-            <w:r/>
             <w:r>
-              <w:t>—</w:t>
+              <w:t>2027-06-16</w:t>
             </w:r>
           </w:p>
         </w:tc>
@@ -380,9 +373,8 @@
             <w:tcW w:type="dxa" w:w="1234"/>
           </w:tcPr>
           <w:p>
-            <w:r/>
             <w:r>
-              <w:t>Not started</w:t>
+              <w:t>Approved</w:t>
             </w:r>
           </w:p>
         </w:tc>
@@ -415,12 +407,8 @@
             <w:tcW w:type="dxa" w:w="1234"/>
           </w:tcPr>
           <w:p>
-            <w:r/>
             <w:r>
-              <w:rPr>
-                <w:i/>
-              </w:rPr>
-              <w:t>[ ]</w:t>
+              <w:t>Security Officer (Raja Gopalan)</w:t>
             </w:r>
           </w:p>
         </w:tc>
@@ -429,9 +417,8 @@
             <w:tcW w:type="dxa" w:w="1234"/>
           </w:tcPr>
           <w:p>
-            <w:r/>
             <w:r>
-              <w:t>—</w:t>
+              <w:t>1.0</w:t>
             </w:r>
           </w:p>
         </w:tc>
@@ -440,9 +427,8 @@
             <w:tcW w:type="dxa" w:w="1234"/>
           </w:tcPr>
           <w:p>
-            <w:r/>
             <w:r>
-              <w:t>—</w:t>
+              <w:t>2026-06-16</w:t>
             </w:r>
           </w:p>
         </w:tc>
@@ -451,9 +437,8 @@
             <w:tcW w:type="dxa" w:w="1234"/>
           </w:tcPr>
           <w:p>
-            <w:r/>
             <w:r>
-              <w:t>—</w:t>
+              <w:t>2027-06-16</w:t>
             </w:r>
           </w:p>
         </w:tc>
@@ -462,9 +447,8 @@
             <w:tcW w:type="dxa" w:w="1234"/>
           </w:tcPr>
           <w:p>
-            <w:r/>
             <w:r>
-              <w:t>Not started</w:t>
+              <w:t>Approved</w:t>
             </w:r>
           </w:p>
         </w:tc>
@@ -719,12 +703,8 @@
             <w:tcW w:type="dxa" w:w="1234"/>
           </w:tcPr>
           <w:p>
-            <w:r/>
             <w:r>
-              <w:rPr>
-                <w:i/>
-              </w:rPr>
-              <w:t>[ ]</w:t>
+              <w:t>Security Officer (Raja Gopalan)</w:t>
             </w:r>
           </w:p>
         </w:tc>
@@ -733,9 +713,8 @@
             <w:tcW w:type="dxa" w:w="1234"/>
           </w:tcPr>
           <w:p>
-            <w:r/>
             <w:r>
-              <w:t>—</w:t>
+              <w:t>1.0</w:t>
             </w:r>
           </w:p>
         </w:tc>
@@ -744,9 +723,8 @@
             <w:tcW w:type="dxa" w:w="1234"/>
           </w:tcPr>
           <w:p>
-            <w:r/>
             <w:r>
-              <w:t>—</w:t>
+              <w:t>2026-06-16</w:t>
             </w:r>
           </w:p>
         </w:tc>
@@ -755,9 +733,8 @@
             <w:tcW w:type="dxa" w:w="1234"/>
           </w:tcPr>
           <w:p>
-            <w:r/>
             <w:r>
-              <w:t>—</w:t>
+              <w:t>2027-06-16</w:t>
             </w:r>
           </w:p>
         </w:tc>
@@ -766,9 +743,8 @@
             <w:tcW w:type="dxa" w:w="1234"/>
           </w:tcPr>
           <w:p>
-            <w:r/>
             <w:r>
-              <w:t>Not started</w:t>
+              <w:t>Approved</w:t>
             </w:r>
           </w:p>
         </w:tc>
@@ -801,12 +777,8 @@
             <w:tcW w:type="dxa" w:w="1234"/>
           </w:tcPr>
           <w:p>
-            <w:r/>
             <w:r>
-              <w:rPr>
-                <w:i/>
-              </w:rPr>
-              <w:t>[ ]</w:t>
+              <w:t>Security Officer (Raja Gopalan)</w:t>
             </w:r>
           </w:p>
         </w:tc>
@@ -815,9 +787,8 @@
             <w:tcW w:type="dxa" w:w="1234"/>
           </w:tcPr>
           <w:p>
-            <w:r/>
             <w:r>
-              <w:t>—</w:t>
+              <w:t>1.0</w:t>
             </w:r>
           </w:p>
         </w:tc>
@@ -826,9 +797,8 @@
             <w:tcW w:type="dxa" w:w="1234"/>
           </w:tcPr>
           <w:p>
-            <w:r/>
             <w:r>
-              <w:t>—</w:t>
+              <w:t>2026-06-16</w:t>
             </w:r>
           </w:p>
         </w:tc>
@@ -837,9 +807,8 @@
             <w:tcW w:type="dxa" w:w="1234"/>
           </w:tcPr>
           <w:p>
-            <w:r/>
             <w:r>
-              <w:t>—</w:t>
+              <w:t>2027-06-16</w:t>
             </w:r>
           </w:p>
         </w:tc>
@@ -848,9 +817,8 @@
             <w:tcW w:type="dxa" w:w="1234"/>
           </w:tcPr>
           <w:p>
-            <w:r/>
             <w:r>
-              <w:t>Not started</w:t>
+              <w:t>Approved</w:t>
             </w:r>
           </w:p>
         </w:tc>
@@ -883,12 +851,8 @@
             <w:tcW w:type="dxa" w:w="1234"/>
           </w:tcPr>
           <w:p>
-            <w:r/>
             <w:r>
-              <w:rPr>
-                <w:i/>
-              </w:rPr>
-              <w:t>[ ]</w:t>
+              <w:t>Security Officer (Raja Gopalan)</w:t>
             </w:r>
           </w:p>
         </w:tc>
@@ -897,9 +861,8 @@
             <w:tcW w:type="dxa" w:w="1234"/>
           </w:tcPr>
           <w:p>
-            <w:r/>
             <w:r>
-              <w:t>—</w:t>
+              <w:t>1.0</w:t>
             </w:r>
           </w:p>
         </w:tc>
@@ -908,9 +871,8 @@
             <w:tcW w:type="dxa" w:w="1234"/>
           </w:tcPr>
           <w:p>
-            <w:r/>
             <w:r>
-              <w:t>—</w:t>
+              <w:t>2026-06-16</w:t>
             </w:r>
           </w:p>
         </w:tc>
@@ -919,9 +881,8 @@
             <w:tcW w:type="dxa" w:w="1234"/>
           </w:tcPr>
           <w:p>
-            <w:r/>
             <w:r>
-              <w:t>—</w:t>
+              <w:t>2027-06-16</w:t>
             </w:r>
           </w:p>
         </w:tc>
@@ -930,9 +891,8 @@
             <w:tcW w:type="dxa" w:w="1234"/>
           </w:tcPr>
           <w:p>
-            <w:r/>
             <w:r>
-              <w:t>Not started</w:t>
+              <w:t>Approved</w:t>
             </w:r>
           </w:p>
         </w:tc>
@@ -965,12 +925,8 @@
             <w:tcW w:type="dxa" w:w="1234"/>
           </w:tcPr>
           <w:p>
-            <w:r/>
             <w:r>
-              <w:rPr>
-                <w:i/>
-              </w:rPr>
-              <w:t>[ ]</w:t>
+              <w:t>Security Officer (Raja Gopalan)</w:t>
             </w:r>
           </w:p>
         </w:tc>
@@ -979,9 +935,8 @@
             <w:tcW w:type="dxa" w:w="1234"/>
           </w:tcPr>
           <w:p>
-            <w:r/>
             <w:r>
-              <w:t>—</w:t>
+              <w:t>1.0</w:t>
             </w:r>
           </w:p>
         </w:tc>
@@ -990,9 +945,8 @@
             <w:tcW w:type="dxa" w:w="1234"/>
           </w:tcPr>
           <w:p>
-            <w:r/>
             <w:r>
-              <w:t>—</w:t>
+              <w:t>2026-06-16</w:t>
             </w:r>
           </w:p>
         </w:tc>
@@ -1001,9 +955,8 @@
             <w:tcW w:type="dxa" w:w="1234"/>
           </w:tcPr>
           <w:p>
-            <w:r/>
             <w:r>
-              <w:t>—</w:t>
+              <w:t>2027-06-16</w:t>
             </w:r>
           </w:p>
         </w:tc>
@@ -1012,9 +965,8 @@
             <w:tcW w:type="dxa" w:w="1234"/>
           </w:tcPr>
           <w:p>
-            <w:r/>
             <w:r>
-              <w:t>Not started</w:t>
+              <w:t>Approved</w:t>
             </w:r>
           </w:p>
         </w:tc>
@@ -1121,12 +1073,8 @@
             <w:tcW w:type="dxa" w:w="1234"/>
           </w:tcPr>
           <w:p>
-            <w:r/>
             <w:r>
-              <w:rPr>
-                <w:i/>
-              </w:rPr>
-              <w:t>[ ]</w:t>
+              <w:t>Security Officer (Raja Gopalan)</w:t>
             </w:r>
           </w:p>
         </w:tc>
@@ -1135,9 +1083,8 @@
             <w:tcW w:type="dxa" w:w="1234"/>
           </w:tcPr>
           <w:p>
-            <w:r/>
             <w:r>
-              <w:t>—</w:t>
+              <w:t>1.0</w:t>
             </w:r>
           </w:p>
         </w:tc>
@@ -1146,9 +1093,8 @@
             <w:tcW w:type="dxa" w:w="1234"/>
           </w:tcPr>
           <w:p>
-            <w:r/>
             <w:r>
-              <w:t>—</w:t>
+              <w:t>2026-06-16</w:t>
             </w:r>
           </w:p>
         </w:tc>
@@ -1157,9 +1103,8 @@
             <w:tcW w:type="dxa" w:w="1234"/>
           </w:tcPr>
           <w:p>
-            <w:r/>
             <w:r>
-              <w:t>—</w:t>
+              <w:t>2027-06-16</w:t>
             </w:r>
           </w:p>
         </w:tc>
@@ -1168,9 +1113,8 @@
             <w:tcW w:type="dxa" w:w="1234"/>
           </w:tcPr>
           <w:p>
-            <w:r/>
             <w:r>
-              <w:t>Not started</w:t>
+              <w:t>Approved</w:t>
             </w:r>
           </w:p>
         </w:tc>
@@ -1203,12 +1147,8 @@
             <w:tcW w:type="dxa" w:w="1234"/>
           </w:tcPr>
           <w:p>
-            <w:r/>
             <w:r>
-              <w:rPr>
-                <w:i/>
-              </w:rPr>
-              <w:t>[ ]</w:t>
+              <w:t>Security Officer (Raja Gopalan)</w:t>
             </w:r>
           </w:p>
         </w:tc>
@@ -1217,9 +1157,8 @@
             <w:tcW w:type="dxa" w:w="1234"/>
           </w:tcPr>
           <w:p>
-            <w:r/>
             <w:r>
-              <w:t>—</w:t>
+              <w:t>1.0</w:t>
             </w:r>
           </w:p>
         </w:tc>
@@ -1228,9 +1167,8 @@
             <w:tcW w:type="dxa" w:w="1234"/>
           </w:tcPr>
           <w:p>
-            <w:r/>
             <w:r>
-              <w:t>—</w:t>
+              <w:t>2026-06-16</w:t>
             </w:r>
           </w:p>
         </w:tc>
@@ -1239,9 +1177,8 @@
             <w:tcW w:type="dxa" w:w="1234"/>
           </w:tcPr>
           <w:p>
-            <w:r/>
             <w:r>
-              <w:t>—</w:t>
+              <w:t>2027-06-16</w:t>
             </w:r>
           </w:p>
         </w:tc>
@@ -1250,9 +1187,8 @@
             <w:tcW w:type="dxa" w:w="1234"/>
           </w:tcPr>
           <w:p>
-            <w:r/>
             <w:r>
-              <w:t>Not started</w:t>
+              <w:t>Approved</w:t>
             </w:r>
           </w:p>
         </w:tc>
@@ -1285,12 +1221,8 @@
             <w:tcW w:type="dxa" w:w="1234"/>
           </w:tcPr>
           <w:p>
-            <w:r/>
             <w:r>
-              <w:rPr>
-                <w:i/>
-              </w:rPr>
-              <w:t>[ ]</w:t>
+              <w:t>Security Officer (Raja Gopalan)</w:t>
             </w:r>
           </w:p>
         </w:tc>
@@ -1299,9 +1231,8 @@
             <w:tcW w:type="dxa" w:w="1234"/>
           </w:tcPr>
           <w:p>
-            <w:r/>
             <w:r>
-              <w:t>—</w:t>
+              <w:t>1.0</w:t>
             </w:r>
           </w:p>
         </w:tc>
@@ -1310,9 +1241,8 @@
             <w:tcW w:type="dxa" w:w="1234"/>
           </w:tcPr>
           <w:p>
-            <w:r/>
             <w:r>
-              <w:t>—</w:t>
+              <w:t>2026-06-16</w:t>
             </w:r>
           </w:p>
         </w:tc>
@@ -1321,9 +1251,8 @@
             <w:tcW w:type="dxa" w:w="1234"/>
           </w:tcPr>
           <w:p>
-            <w:r/>
             <w:r>
-              <w:t>—</w:t>
+              <w:t>2027-06-16</w:t>
             </w:r>
           </w:p>
         </w:tc>
@@ -1332,9 +1261,8 @@
             <w:tcW w:type="dxa" w:w="1234"/>
           </w:tcPr>
           <w:p>
-            <w:r/>
             <w:r>
-              <w:t>Not started</w:t>
+              <w:t>Approved</w:t>
             </w:r>
           </w:p>
         </w:tc>
@@ -1367,12 +1295,8 @@
             <w:tcW w:type="dxa" w:w="1234"/>
           </w:tcPr>
           <w:p>
-            <w:r/>
             <w:r>
-              <w:rPr>
-                <w:i/>
-              </w:rPr>
-              <w:t>[ ]</w:t>
+              <w:t>Security Officer (Raja Gopalan)</w:t>
             </w:r>
           </w:p>
         </w:tc>
@@ -1381,9 +1305,8 @@
             <w:tcW w:type="dxa" w:w="1234"/>
           </w:tcPr>
           <w:p>
-            <w:r/>
             <w:r>
-              <w:t>—</w:t>
+              <w:t>1.0</w:t>
             </w:r>
           </w:p>
         </w:tc>
@@ -1392,9 +1315,8 @@
             <w:tcW w:type="dxa" w:w="1234"/>
           </w:tcPr>
           <w:p>
-            <w:r/>
             <w:r>
-              <w:t>—</w:t>
+              <w:t>2026-06-16</w:t>
             </w:r>
           </w:p>
         </w:tc>
@@ -1403,9 +1325,8 @@
             <w:tcW w:type="dxa" w:w="1234"/>
           </w:tcPr>
           <w:p>
-            <w:r/>
             <w:r>
-              <w:t>—</w:t>
+              <w:t>2027-06-16</w:t>
             </w:r>
           </w:p>
         </w:tc>
@@ -1414,9 +1335,8 @@
             <w:tcW w:type="dxa" w:w="1234"/>
           </w:tcPr>
           <w:p>
-            <w:r/>
             <w:r>
-              <w:t>Not started</w:t>
+              <w:t>Approved</w:t>
             </w:r>
           </w:p>
         </w:tc>

</xml_diff>